<commit_message>
docs: rename block reward transactions
</commit_message>
<xml_diff>
--- a/docs/ClearCrest_White_Paper.docx
+++ b/docs/ClearCrest_White_Paper.docx
@@ -134,7 +134,7 @@
           <w:i w:val="0"/>
           <w:sz w:val="20"/>
         </w:rPr>
-        <w:t>Consensus is deliberately narrow. Every amount is represented as an integer number of quanta and is checked against the maximum supply before it affects state. Lock height and lock time are separate fields. Coinbase transactions include their block height. The difficulty calculation consumes an exact 2,016-block interval. Timestamps are 64-bit values and must satisfy median-time rules. These choices remove ambiguity that can turn edge cases into consensus splits.</w:t>
+        <w:t>Consensus is deliberately narrow. Every amount is represented as an integer number of quanta and is checked against the maximum supply before it affects state. Lock height and lock time are separate fields. Block-reward transactions include their block height. The difficulty calculation consumes an exact 2,016-block interval. Timestamps are 64-bit values and must satisfy median-time rules. These choices remove ambiguity that can turn edge cases into consensus splits.</w:t>
       </w:r>
     </w:p>
     <w:p>
@@ -378,7 +378,7 @@
           <w:i w:val="0"/>
           <w:sz w:val="20"/>
         </w:rPr>
-        <w:t>The first transaction of each valid block is a coinbase transaction. Its height is committed in the transaction data, making its identifier unique across blocks. Its value equals the scheduled subsidy at that height plus fees permitted by the block. The initial subsidy is 5,000,000,000 quanta and halves every 210,000 blocks. No calculation may create more than 2,100,000,000,000,000 quanta in total. Coinbase outputs mature after 100 completed blocks.</w:t>
+        <w:t>The first transaction of each valid block is a block-reward transaction. Its height is committed in the transaction data, making its identifier unique across blocks. Its value equals the scheduled subsidy at that height plus fees permitted by the block. The initial subsidy is 5,000,000,000 quanta and halves every 210,000 blocks. No calculation may create more than 2,100,000,000,000,000 quanta in total. Block-reward outputs mature after 100 completed blocks.</w:t>
       </w:r>
     </w:p>
     <w:p>

</xml_diff>